<commit_message>
Version 3.1 y 3.2 Implementacion camara
</commit_message>
<xml_diff>
--- a/Readme.docx
+++ b/Readme.docx
@@ -2584,7 +2584,7 @@
       </w:pPr>
       <w:r>
         <w:pict w14:anchorId="12DAF416">
-          <v:rect id="_x0000_i1031" style="width:0;height:.75pt" o:hralign="center" o:hrstd="t" o:hrnoshade="t" o:hr="t" fillcolor="#f8faff" stroked="f"/>
+          <v:rect id="_x0000_i1025" style="width:0;height:.75pt" o:hralign="center" o:hrstd="t" o:hrnoshade="t" o:hr="t" fillcolor="#f8faff" stroked="f"/>
         </w:pict>
       </w:r>
     </w:p>
@@ -4315,6 +4315,524 @@
             </a:graphic>
           </wp:inline>
         </w:drawing>
+      </w:r>
+    </w:p>
+    <w:p>
+      <w:pPr>
+        <w:spacing w:after="0" w:line="259" w:lineRule="auto"/>
+        <w:ind w:left="-2" w:right="-43" w:firstLine="0"/>
+        <w:jc w:val="center"/>
+        <w:rPr>
+          <w:rFonts w:ascii="Calibri" w:eastAsia="Calibri" w:hAnsi="Calibri" w:cs="Calibri"/>
+          <w:b/>
+          <w:bCs/>
+          <w:noProof/>
+          <w:sz w:val="22"/>
+          <w:u w:val="single"/>
+        </w:rPr>
+      </w:pPr>
+      <w:r>
+        <w:rPr>
+          <w:rFonts w:ascii="Calibri" w:eastAsia="Calibri" w:hAnsi="Calibri" w:cs="Calibri"/>
+          <w:b/>
+          <w:bCs/>
+          <w:noProof/>
+          <w:sz w:val="22"/>
+          <w:u w:val="single"/>
+        </w:rPr>
+        <w:lastRenderedPageBreak/>
+        <w:t>VERSION 3.1 Y 3.2</w:t>
+      </w:r>
+    </w:p>
+    <w:p>
+      <w:pPr>
+        <w:spacing w:after="0" w:line="259" w:lineRule="auto"/>
+        <w:ind w:left="-2" w:right="-43" w:firstLine="0"/>
+        <w:jc w:val="center"/>
+        <w:rPr>
+          <w:rFonts w:ascii="Calibri" w:eastAsia="Calibri" w:hAnsi="Calibri" w:cs="Calibri"/>
+          <w:b/>
+          <w:bCs/>
+          <w:noProof/>
+          <w:sz w:val="22"/>
+          <w:u w:val="single"/>
+        </w:rPr>
+      </w:pPr>
+    </w:p>
+    <w:p>
+      <w:pPr>
+        <w:spacing w:after="0" w:line="259" w:lineRule="auto"/>
+        <w:ind w:left="-2" w:right="-43" w:firstLine="0"/>
+        <w:rPr>
+          <w:rFonts w:ascii="Calibri" w:eastAsia="Calibri" w:hAnsi="Calibri" w:cs="Calibri"/>
+          <w:b/>
+          <w:bCs/>
+          <w:noProof/>
+          <w:sz w:val="22"/>
+          <w:u w:val="single"/>
+        </w:rPr>
+      </w:pPr>
+      <w:r>
+        <w:rPr>
+          <w:rFonts w:ascii="Calibri" w:eastAsia="Calibri" w:hAnsi="Calibri" w:cs="Calibri"/>
+          <w:b/>
+          <w:bCs/>
+          <w:noProof/>
+          <w:sz w:val="22"/>
+          <w:u w:val="single"/>
+        </w:rPr>
+        <w:t>Características Implementadas</w:t>
+      </w:r>
+    </w:p>
+    <w:p>
+      <w:pPr>
+        <w:numPr>
+          <w:ilvl w:val="0"/>
+          <w:numId w:val="12"/>
+        </w:numPr>
+        <w:spacing w:after="0" w:line="259" w:lineRule="auto"/>
+        <w:ind w:right="-43"/>
+        <w:rPr>
+          <w:rFonts w:ascii="Calibri" w:eastAsia="Calibri" w:hAnsi="Calibri" w:cs="Calibri"/>
+          <w:noProof/>
+          <w:sz w:val="22"/>
+        </w:rPr>
+      </w:pPr>
+      <w:r>
+        <w:rPr>
+          <w:rFonts w:ascii="Calibri" w:eastAsia="Calibri" w:hAnsi="Calibri" w:cs="Calibri"/>
+          <w:b/>
+          <w:bCs/>
+          <w:noProof/>
+          <w:sz w:val="22"/>
+        </w:rPr>
+        <w:t>Captura de Imagen desde la Cámara</w:t>
+      </w:r>
+    </w:p>
+    <w:p>
+      <w:pPr>
+        <w:numPr>
+          <w:ilvl w:val="1"/>
+          <w:numId w:val="12"/>
+        </w:numPr>
+        <w:spacing w:after="0" w:line="259" w:lineRule="auto"/>
+        <w:ind w:right="-43"/>
+        <w:rPr>
+          <w:rFonts w:ascii="Calibri" w:eastAsia="Calibri" w:hAnsi="Calibri" w:cs="Calibri"/>
+          <w:noProof/>
+          <w:sz w:val="22"/>
+        </w:rPr>
+      </w:pPr>
+      <w:r>
+        <w:rPr>
+          <w:rFonts w:ascii="Calibri" w:eastAsia="Calibri" w:hAnsi="Calibri" w:cs="Calibri"/>
+          <w:noProof/>
+          <w:sz w:val="22"/>
+        </w:rPr>
+        <w:t>Los usuarios pueden tomar fotos directamente desde la cámara de su dispositivo para utilizarlas en la aplicación.</w:t>
+      </w:r>
+    </w:p>
+    <w:p>
+      <w:pPr>
+        <w:numPr>
+          <w:ilvl w:val="0"/>
+          <w:numId w:val="12"/>
+        </w:numPr>
+        <w:spacing w:after="0" w:line="259" w:lineRule="auto"/>
+        <w:ind w:right="-43"/>
+        <w:rPr>
+          <w:rFonts w:ascii="Calibri" w:eastAsia="Calibri" w:hAnsi="Calibri" w:cs="Calibri"/>
+          <w:noProof/>
+          <w:sz w:val="22"/>
+        </w:rPr>
+      </w:pPr>
+      <w:r>
+        <w:rPr>
+          <w:rFonts w:ascii="Calibri" w:eastAsia="Calibri" w:hAnsi="Calibri" w:cs="Calibri"/>
+          <w:b/>
+          <w:bCs/>
+          <w:noProof/>
+          <w:sz w:val="22"/>
+        </w:rPr>
+        <w:t>Selección de Imagen desde la Galería</w:t>
+      </w:r>
+    </w:p>
+    <w:p>
+      <w:pPr>
+        <w:numPr>
+          <w:ilvl w:val="1"/>
+          <w:numId w:val="12"/>
+        </w:numPr>
+        <w:spacing w:after="0" w:line="259" w:lineRule="auto"/>
+        <w:ind w:right="-43"/>
+        <w:rPr>
+          <w:rFonts w:ascii="Calibri" w:eastAsia="Calibri" w:hAnsi="Calibri" w:cs="Calibri"/>
+          <w:noProof/>
+          <w:sz w:val="22"/>
+        </w:rPr>
+      </w:pPr>
+      <w:r>
+        <w:rPr>
+          <w:rFonts w:ascii="Calibri" w:eastAsia="Calibri" w:hAnsi="Calibri" w:cs="Calibri"/>
+          <w:noProof/>
+          <w:sz w:val="22"/>
+        </w:rPr>
+        <w:t>Además de la captura de imágenes, los usuarios pueden seleccionar imágenes desde la galería de su dispositivo.</w:t>
+      </w:r>
+    </w:p>
+    <w:p>
+      <w:pPr>
+        <w:numPr>
+          <w:ilvl w:val="0"/>
+          <w:numId w:val="12"/>
+        </w:numPr>
+        <w:spacing w:after="0" w:line="259" w:lineRule="auto"/>
+        <w:ind w:right="-43"/>
+        <w:rPr>
+          <w:rFonts w:ascii="Calibri" w:eastAsia="Calibri" w:hAnsi="Calibri" w:cs="Calibri"/>
+          <w:noProof/>
+          <w:sz w:val="22"/>
+        </w:rPr>
+      </w:pPr>
+      <w:r>
+        <w:rPr>
+          <w:rFonts w:ascii="Calibri" w:eastAsia="Calibri" w:hAnsi="Calibri" w:cs="Calibri"/>
+          <w:b/>
+          <w:bCs/>
+          <w:noProof/>
+          <w:sz w:val="22"/>
+        </w:rPr>
+        <w:t>Permisos en Tiempo de Ejecución</w:t>
+      </w:r>
+    </w:p>
+    <w:p>
+      <w:pPr>
+        <w:numPr>
+          <w:ilvl w:val="1"/>
+          <w:numId w:val="12"/>
+        </w:numPr>
+        <w:spacing w:after="0" w:line="259" w:lineRule="auto"/>
+        <w:ind w:right="-43"/>
+        <w:rPr>
+          <w:rFonts w:ascii="Calibri" w:eastAsia="Calibri" w:hAnsi="Calibri" w:cs="Calibri"/>
+          <w:noProof/>
+          <w:sz w:val="22"/>
+        </w:rPr>
+      </w:pPr>
+      <w:r>
+        <w:rPr>
+          <w:rFonts w:ascii="Calibri" w:eastAsia="Calibri" w:hAnsi="Calibri" w:cs="Calibri"/>
+          <w:noProof/>
+          <w:sz w:val="22"/>
+        </w:rPr>
+        <w:t>Se solicitan permisos en tiempo de ejecución para el acceso a la cámara y al almacenamiento, garantizando el cumplimiento de las políticas de privacidad y seguridad.</w:t>
+      </w:r>
+    </w:p>
+    <w:p>
+      <w:pPr>
+        <w:numPr>
+          <w:ilvl w:val="0"/>
+          <w:numId w:val="12"/>
+        </w:numPr>
+        <w:spacing w:after="0" w:line="259" w:lineRule="auto"/>
+        <w:ind w:right="-43"/>
+        <w:rPr>
+          <w:rFonts w:ascii="Calibri" w:eastAsia="Calibri" w:hAnsi="Calibri" w:cs="Calibri"/>
+          <w:noProof/>
+          <w:sz w:val="22"/>
+        </w:rPr>
+      </w:pPr>
+      <w:r>
+        <w:rPr>
+          <w:rFonts w:ascii="Calibri" w:eastAsia="Calibri" w:hAnsi="Calibri" w:cs="Calibri"/>
+          <w:b/>
+          <w:bCs/>
+          <w:noProof/>
+          <w:sz w:val="22"/>
+        </w:rPr>
+        <w:t>Conversión de Imágenes a Base64</w:t>
+      </w:r>
+    </w:p>
+    <w:p>
+      <w:pPr>
+        <w:numPr>
+          <w:ilvl w:val="1"/>
+          <w:numId w:val="12"/>
+        </w:numPr>
+        <w:spacing w:after="0" w:line="259" w:lineRule="auto"/>
+        <w:ind w:right="-43"/>
+        <w:rPr>
+          <w:rFonts w:ascii="Calibri" w:eastAsia="Calibri" w:hAnsi="Calibri" w:cs="Calibri"/>
+          <w:noProof/>
+          <w:sz w:val="22"/>
+        </w:rPr>
+      </w:pPr>
+      <w:r>
+        <w:rPr>
+          <w:rFonts w:ascii="Calibri" w:eastAsia="Calibri" w:hAnsi="Calibri" w:cs="Calibri"/>
+          <w:noProof/>
+          <w:sz w:val="22"/>
+        </w:rPr>
+        <w:t>Se preparó un método para convertir imágenes en formato bitmap a Base64, facilitando su manipulación y almacenamiento para futuras implementaciones.</w:t>
+      </w:r>
+    </w:p>
+    <w:p>
+      <w:pPr>
+        <w:numPr>
+          <w:ilvl w:val="0"/>
+          <w:numId w:val="12"/>
+        </w:numPr>
+        <w:spacing w:after="0" w:line="259" w:lineRule="auto"/>
+        <w:ind w:right="-43"/>
+        <w:rPr>
+          <w:rFonts w:ascii="Calibri" w:eastAsia="Calibri" w:hAnsi="Calibri" w:cs="Calibri"/>
+          <w:noProof/>
+          <w:sz w:val="22"/>
+        </w:rPr>
+      </w:pPr>
+      <w:r>
+        <w:rPr>
+          <w:rFonts w:ascii="Calibri" w:eastAsia="Calibri" w:hAnsi="Calibri" w:cs="Calibri"/>
+          <w:b/>
+          <w:bCs/>
+          <w:noProof/>
+          <w:sz w:val="22"/>
+        </w:rPr>
+        <w:t>Visualización en DialogFragment</w:t>
+      </w:r>
+    </w:p>
+    <w:p>
+      <w:pPr>
+        <w:numPr>
+          <w:ilvl w:val="1"/>
+          <w:numId w:val="12"/>
+        </w:numPr>
+        <w:spacing w:after="0" w:line="259" w:lineRule="auto"/>
+        <w:ind w:right="-43"/>
+        <w:rPr>
+          <w:rFonts w:ascii="Calibri" w:eastAsia="Calibri" w:hAnsi="Calibri" w:cs="Calibri"/>
+          <w:noProof/>
+          <w:sz w:val="22"/>
+        </w:rPr>
+      </w:pPr>
+      <w:r>
+        <w:rPr>
+          <w:rFonts w:ascii="Calibri" w:eastAsia="Calibri" w:hAnsi="Calibri" w:cs="Calibri"/>
+          <w:noProof/>
+          <w:sz w:val="22"/>
+        </w:rPr>
+        <w:t>Se incluye un ImageView en el DialogFragment de creación/modificación de ítems para mostrar la imagen capturada o seleccionada.</w:t>
+      </w:r>
+    </w:p>
+    <w:p>
+      <w:pPr>
+        <w:spacing w:after="0" w:line="259" w:lineRule="auto"/>
+        <w:ind w:left="-2" w:right="-43" w:firstLine="0"/>
+        <w:rPr>
+          <w:rFonts w:ascii="Calibri" w:eastAsia="Calibri" w:hAnsi="Calibri" w:cs="Calibri"/>
+          <w:b/>
+          <w:bCs/>
+          <w:noProof/>
+          <w:sz w:val="22"/>
+          <w:u w:val="single"/>
+        </w:rPr>
+      </w:pPr>
+      <w:r>
+        <w:rPr>
+          <w:rFonts w:ascii="Calibri" w:eastAsia="Calibri" w:hAnsi="Calibri" w:cs="Calibri"/>
+          <w:b/>
+          <w:bCs/>
+          <w:noProof/>
+          <w:sz w:val="22"/>
+          <w:u w:val="single"/>
+        </w:rPr>
+        <w:t>Configuración Técnica</w:t>
+      </w:r>
+    </w:p>
+    <w:p>
+      <w:pPr>
+        <w:numPr>
+          <w:ilvl w:val="0"/>
+          <w:numId w:val="13"/>
+        </w:numPr>
+        <w:spacing w:after="0" w:line="259" w:lineRule="auto"/>
+        <w:ind w:right="-43"/>
+        <w:rPr>
+          <w:rFonts w:ascii="Calibri" w:eastAsia="Calibri" w:hAnsi="Calibri" w:cs="Calibri"/>
+          <w:noProof/>
+          <w:sz w:val="22"/>
+        </w:rPr>
+      </w:pPr>
+      <w:r>
+        <w:rPr>
+          <w:rFonts w:ascii="Calibri" w:eastAsia="Calibri" w:hAnsi="Calibri" w:cs="Calibri"/>
+          <w:noProof/>
+          <w:sz w:val="22"/>
+        </w:rPr>
+        <w:t>Se configuró un FileProvider en el archivo AndroidManifest.xml para manejar URIs de archivos de forma segura, evitando conflictos con permisos de acceso a archivos post Android N.</w:t>
+      </w:r>
+    </w:p>
+    <w:p>
+      <w:pPr>
+        <w:numPr>
+          <w:ilvl w:val="0"/>
+          <w:numId w:val="13"/>
+        </w:numPr>
+        <w:spacing w:after="0" w:line="259" w:lineRule="auto"/>
+        <w:ind w:right="-43"/>
+        <w:rPr>
+          <w:rFonts w:ascii="Calibri" w:eastAsia="Calibri" w:hAnsi="Calibri" w:cs="Calibri"/>
+          <w:noProof/>
+          <w:sz w:val="22"/>
+        </w:rPr>
+      </w:pPr>
+      <w:r>
+        <w:rPr>
+          <w:rFonts w:ascii="Calibri" w:eastAsia="Calibri" w:hAnsi="Calibri" w:cs="Calibri"/>
+          <w:noProof/>
+          <w:sz w:val="22"/>
+        </w:rPr>
+        <w:t>Se definieron las rutas accesibles para el FileProvider en el archivo file_paths.xml bajo el directorio res/xml/, asegurando que la aplicación pueda acceder a las imágenes almacenadas de forma temporal o permanente.</w:t>
+      </w:r>
+    </w:p>
+    <w:p>
+      <w:pPr>
+        <w:spacing w:after="0" w:line="259" w:lineRule="auto"/>
+        <w:ind w:left="-2" w:right="-43" w:firstLine="0"/>
+        <w:rPr>
+          <w:rFonts w:ascii="Calibri" w:eastAsia="Calibri" w:hAnsi="Calibri" w:cs="Calibri"/>
+          <w:b/>
+          <w:bCs/>
+          <w:noProof/>
+          <w:sz w:val="22"/>
+          <w:u w:val="single"/>
+        </w:rPr>
+      </w:pPr>
+      <w:r>
+        <w:rPr>
+          <w:rFonts w:ascii="Calibri" w:eastAsia="Calibri" w:hAnsi="Calibri" w:cs="Calibri"/>
+          <w:b/>
+          <w:bCs/>
+          <w:noProof/>
+          <w:sz w:val="22"/>
+          <w:u w:val="single"/>
+        </w:rPr>
+        <w:t>Uso</w:t>
+      </w:r>
+    </w:p>
+    <w:p>
+      <w:pPr>
+        <w:spacing w:after="0" w:line="259" w:lineRule="auto"/>
+        <w:ind w:left="-2" w:right="-43" w:firstLine="0"/>
+        <w:rPr>
+          <w:rFonts w:ascii="Calibri" w:eastAsia="Calibri" w:hAnsi="Calibri" w:cs="Calibri"/>
+          <w:noProof/>
+          <w:sz w:val="22"/>
+        </w:rPr>
+      </w:pPr>
+      <w:r>
+        <w:rPr>
+          <w:rFonts w:ascii="Calibri" w:eastAsia="Calibri" w:hAnsi="Calibri" w:cs="Calibri"/>
+          <w:noProof/>
+          <w:sz w:val="22"/>
+        </w:rPr>
+        <w:t>Para utilizar estas funciones, el usuario debe interactuar con los elementos de UI específicos que desencadenan la captura o selección de imágenes. Estas opciones están accesibles a través de botones dedicados en el DialogFragment de modificación de ítems.</w:t>
+      </w:r>
+    </w:p>
+    <w:p>
+      <w:pPr>
+        <w:spacing w:after="0" w:line="259" w:lineRule="auto"/>
+        <w:ind w:left="-2" w:right="-43" w:firstLine="0"/>
+        <w:rPr>
+          <w:rFonts w:ascii="Calibri" w:eastAsia="Calibri" w:hAnsi="Calibri" w:cs="Calibri"/>
+          <w:b/>
+          <w:bCs/>
+          <w:noProof/>
+          <w:sz w:val="22"/>
+          <w:u w:val="single"/>
+        </w:rPr>
+      </w:pPr>
+      <w:r>
+        <w:rPr>
+          <w:rFonts w:ascii="Calibri" w:eastAsia="Calibri" w:hAnsi="Calibri" w:cs="Calibri"/>
+          <w:b/>
+          <w:bCs/>
+          <w:noProof/>
+          <w:sz w:val="22"/>
+          <w:u w:val="single"/>
+        </w:rPr>
+        <w:t>Seguridad y Privacidad</w:t>
+      </w:r>
+    </w:p>
+    <w:p>
+      <w:pPr>
+        <w:numPr>
+          <w:ilvl w:val="0"/>
+          <w:numId w:val="14"/>
+        </w:numPr>
+        <w:spacing w:after="0" w:line="259" w:lineRule="auto"/>
+        <w:ind w:right="-43"/>
+        <w:rPr>
+          <w:rFonts w:ascii="Calibri" w:eastAsia="Calibri" w:hAnsi="Calibri" w:cs="Calibri"/>
+          <w:noProof/>
+          <w:sz w:val="22"/>
+        </w:rPr>
+      </w:pPr>
+      <w:r>
+        <w:rPr>
+          <w:rFonts w:ascii="Calibri" w:eastAsia="Calibri" w:hAnsi="Calibri" w:cs="Calibri"/>
+          <w:noProof/>
+          <w:sz w:val="22"/>
+        </w:rPr>
+        <w:t>Todos los accesos a hardware y almacenamiento externo están regulados por solicitudes de permisos explícitas, conforme a las directrices y mejores prácticas de seguridad de Android.</w:t>
+      </w:r>
+    </w:p>
+    <w:p>
+      <w:pPr>
+        <w:spacing w:after="0" w:line="259" w:lineRule="auto"/>
+        <w:ind w:left="-2" w:right="-43" w:firstLine="0"/>
+        <w:rPr>
+          <w:rFonts w:ascii="Calibri" w:eastAsia="Calibri" w:hAnsi="Calibri" w:cs="Calibri"/>
+          <w:b/>
+          <w:bCs/>
+          <w:noProof/>
+          <w:sz w:val="22"/>
+          <w:u w:val="single"/>
+        </w:rPr>
+      </w:pPr>
+      <w:r>
+        <w:rPr>
+          <w:rFonts w:ascii="Calibri" w:eastAsia="Calibri" w:hAnsi="Calibri" w:cs="Calibri"/>
+          <w:b/>
+          <w:bCs/>
+          <w:noProof/>
+          <w:sz w:val="22"/>
+          <w:u w:val="single"/>
+        </w:rPr>
+        <w:t>Posicionamiento Opcional</w:t>
+      </w:r>
+    </w:p>
+    <w:p>
+      <w:pPr>
+        <w:numPr>
+          <w:ilvl w:val="0"/>
+          <w:numId w:val="15"/>
+        </w:numPr>
+        <w:spacing w:after="0" w:line="259" w:lineRule="auto"/>
+        <w:ind w:right="-43"/>
+        <w:rPr>
+          <w:rFonts w:ascii="Calibri" w:eastAsia="Calibri" w:hAnsi="Calibri" w:cs="Calibri"/>
+          <w:noProof/>
+          <w:sz w:val="22"/>
+        </w:rPr>
+      </w:pPr>
+      <w:r>
+        <w:rPr>
+          <w:rFonts w:ascii="Calibri" w:eastAsia="Calibri" w:hAnsi="Calibri" w:cs="Calibri"/>
+          <w:noProof/>
+          <w:sz w:val="22"/>
+        </w:rPr>
+        <w:t>Se deja como opcional la versión 3.2, que incluiría funcionalidades de geolocalización de ítems usando Google Maps, para aquellos usuarios que deseen añadir contexto geográfico a sus imágenes o ítems.</w:t>
       </w:r>
     </w:p>
     <w:p>
@@ -4597,6 +5115,155 @@
     </w:lvl>
   </w:abstractNum>
   <w:abstractNum w:abstractNumId="1" w15:restartNumberingAfterBreak="0">
+    <w:nsid w:val="04C07BF6"/>
+    <w:multiLevelType w:val="multilevel"/>
+    <w:tmpl w:val="CD0A888C"/>
+    <w:lvl w:ilvl="0">
+      <w:start w:val="1"/>
+      <w:numFmt w:val="bullet"/>
+      <w:lvlText w:val=""/>
+      <w:lvlJc w:val="left"/>
+      <w:pPr>
+        <w:tabs>
+          <w:tab w:val="num" w:pos="720"/>
+        </w:tabs>
+        <w:ind w:left="720" w:hanging="360"/>
+      </w:pPr>
+      <w:rPr>
+        <w:rFonts w:ascii="Symbol" w:hAnsi="Symbol" w:hint="default"/>
+        <w:sz w:val="20"/>
+      </w:rPr>
+    </w:lvl>
+    <w:lvl w:ilvl="1" w:tentative="1">
+      <w:start w:val="1"/>
+      <w:numFmt w:val="bullet"/>
+      <w:lvlText w:val="o"/>
+      <w:lvlJc w:val="left"/>
+      <w:pPr>
+        <w:tabs>
+          <w:tab w:val="num" w:pos="1440"/>
+        </w:tabs>
+        <w:ind w:left="1440" w:hanging="360"/>
+      </w:pPr>
+      <w:rPr>
+        <w:rFonts w:ascii="Courier New" w:hAnsi="Courier New" w:hint="default"/>
+        <w:sz w:val="20"/>
+      </w:rPr>
+    </w:lvl>
+    <w:lvl w:ilvl="2" w:tentative="1">
+      <w:start w:val="1"/>
+      <w:numFmt w:val="bullet"/>
+      <w:lvlText w:val=""/>
+      <w:lvlJc w:val="left"/>
+      <w:pPr>
+        <w:tabs>
+          <w:tab w:val="num" w:pos="2160"/>
+        </w:tabs>
+        <w:ind w:left="2160" w:hanging="360"/>
+      </w:pPr>
+      <w:rPr>
+        <w:rFonts w:ascii="Wingdings" w:hAnsi="Wingdings" w:hint="default"/>
+        <w:sz w:val="20"/>
+      </w:rPr>
+    </w:lvl>
+    <w:lvl w:ilvl="3" w:tentative="1">
+      <w:start w:val="1"/>
+      <w:numFmt w:val="bullet"/>
+      <w:lvlText w:val=""/>
+      <w:lvlJc w:val="left"/>
+      <w:pPr>
+        <w:tabs>
+          <w:tab w:val="num" w:pos="2880"/>
+        </w:tabs>
+        <w:ind w:left="2880" w:hanging="360"/>
+      </w:pPr>
+      <w:rPr>
+        <w:rFonts w:ascii="Wingdings" w:hAnsi="Wingdings" w:hint="default"/>
+        <w:sz w:val="20"/>
+      </w:rPr>
+    </w:lvl>
+    <w:lvl w:ilvl="4" w:tentative="1">
+      <w:start w:val="1"/>
+      <w:numFmt w:val="bullet"/>
+      <w:lvlText w:val=""/>
+      <w:lvlJc w:val="left"/>
+      <w:pPr>
+        <w:tabs>
+          <w:tab w:val="num" w:pos="3600"/>
+        </w:tabs>
+        <w:ind w:left="3600" w:hanging="360"/>
+      </w:pPr>
+      <w:rPr>
+        <w:rFonts w:ascii="Wingdings" w:hAnsi="Wingdings" w:hint="default"/>
+        <w:sz w:val="20"/>
+      </w:rPr>
+    </w:lvl>
+    <w:lvl w:ilvl="5" w:tentative="1">
+      <w:start w:val="1"/>
+      <w:numFmt w:val="bullet"/>
+      <w:lvlText w:val=""/>
+      <w:lvlJc w:val="left"/>
+      <w:pPr>
+        <w:tabs>
+          <w:tab w:val="num" w:pos="4320"/>
+        </w:tabs>
+        <w:ind w:left="4320" w:hanging="360"/>
+      </w:pPr>
+      <w:rPr>
+        <w:rFonts w:ascii="Wingdings" w:hAnsi="Wingdings" w:hint="default"/>
+        <w:sz w:val="20"/>
+      </w:rPr>
+    </w:lvl>
+    <w:lvl w:ilvl="6" w:tentative="1">
+      <w:start w:val="1"/>
+      <w:numFmt w:val="bullet"/>
+      <w:lvlText w:val=""/>
+      <w:lvlJc w:val="left"/>
+      <w:pPr>
+        <w:tabs>
+          <w:tab w:val="num" w:pos="5040"/>
+        </w:tabs>
+        <w:ind w:left="5040" w:hanging="360"/>
+      </w:pPr>
+      <w:rPr>
+        <w:rFonts w:ascii="Wingdings" w:hAnsi="Wingdings" w:hint="default"/>
+        <w:sz w:val="20"/>
+      </w:rPr>
+    </w:lvl>
+    <w:lvl w:ilvl="7" w:tentative="1">
+      <w:start w:val="1"/>
+      <w:numFmt w:val="bullet"/>
+      <w:lvlText w:val=""/>
+      <w:lvlJc w:val="left"/>
+      <w:pPr>
+        <w:tabs>
+          <w:tab w:val="num" w:pos="5760"/>
+        </w:tabs>
+        <w:ind w:left="5760" w:hanging="360"/>
+      </w:pPr>
+      <w:rPr>
+        <w:rFonts w:ascii="Wingdings" w:hAnsi="Wingdings" w:hint="default"/>
+        <w:sz w:val="20"/>
+      </w:rPr>
+    </w:lvl>
+    <w:lvl w:ilvl="8" w:tentative="1">
+      <w:start w:val="1"/>
+      <w:numFmt w:val="bullet"/>
+      <w:lvlText w:val=""/>
+      <w:lvlJc w:val="left"/>
+      <w:pPr>
+        <w:tabs>
+          <w:tab w:val="num" w:pos="6480"/>
+        </w:tabs>
+        <w:ind w:left="6480" w:hanging="360"/>
+      </w:pPr>
+      <w:rPr>
+        <w:rFonts w:ascii="Wingdings" w:hAnsi="Wingdings" w:hint="default"/>
+        <w:sz w:val="20"/>
+      </w:rPr>
+    </w:lvl>
+  </w:abstractNum>
+  <w:abstractNum w:abstractNumId="2" w15:restartNumberingAfterBreak="0">
     <w:nsid w:val="0A19115F"/>
     <w:multiLevelType w:val="hybridMultilevel"/>
     <w:tmpl w:val="1AA6C090"/>
@@ -4808,7 +5475,7 @@
       </w:rPr>
     </w:lvl>
   </w:abstractNum>
-  <w:abstractNum w:abstractNumId="2" w15:restartNumberingAfterBreak="0">
+  <w:abstractNum w:abstractNumId="3" w15:restartNumberingAfterBreak="0">
     <w:nsid w:val="0C5D712A"/>
     <w:multiLevelType w:val="hybridMultilevel"/>
     <w:tmpl w:val="BB925722"/>
@@ -4897,7 +5564,7 @@
       </w:pPr>
     </w:lvl>
   </w:abstractNum>
-  <w:abstractNum w:abstractNumId="3" w15:restartNumberingAfterBreak="0">
+  <w:abstractNum w:abstractNumId="4" w15:restartNumberingAfterBreak="0">
     <w:nsid w:val="1D590E5B"/>
     <w:multiLevelType w:val="hybridMultilevel"/>
     <w:tmpl w:val="C8E81492"/>
@@ -5110,7 +5777,156 @@
       </w:rPr>
     </w:lvl>
   </w:abstractNum>
-  <w:abstractNum w:abstractNumId="4" w15:restartNumberingAfterBreak="0">
+  <w:abstractNum w:abstractNumId="5" w15:restartNumberingAfterBreak="0">
+    <w:nsid w:val="2D6652DE"/>
+    <w:multiLevelType w:val="multilevel"/>
+    <w:tmpl w:val="9DD6B410"/>
+    <w:lvl w:ilvl="0">
+      <w:start w:val="1"/>
+      <w:numFmt w:val="bullet"/>
+      <w:lvlText w:val=""/>
+      <w:lvlJc w:val="left"/>
+      <w:pPr>
+        <w:tabs>
+          <w:tab w:val="num" w:pos="720"/>
+        </w:tabs>
+        <w:ind w:left="720" w:hanging="360"/>
+      </w:pPr>
+      <w:rPr>
+        <w:rFonts w:ascii="Symbol" w:hAnsi="Symbol" w:hint="default"/>
+        <w:sz w:val="20"/>
+      </w:rPr>
+    </w:lvl>
+    <w:lvl w:ilvl="1" w:tentative="1">
+      <w:start w:val="1"/>
+      <w:numFmt w:val="bullet"/>
+      <w:lvlText w:val="o"/>
+      <w:lvlJc w:val="left"/>
+      <w:pPr>
+        <w:tabs>
+          <w:tab w:val="num" w:pos="1440"/>
+        </w:tabs>
+        <w:ind w:left="1440" w:hanging="360"/>
+      </w:pPr>
+      <w:rPr>
+        <w:rFonts w:ascii="Courier New" w:hAnsi="Courier New" w:hint="default"/>
+        <w:sz w:val="20"/>
+      </w:rPr>
+    </w:lvl>
+    <w:lvl w:ilvl="2" w:tentative="1">
+      <w:start w:val="1"/>
+      <w:numFmt w:val="bullet"/>
+      <w:lvlText w:val=""/>
+      <w:lvlJc w:val="left"/>
+      <w:pPr>
+        <w:tabs>
+          <w:tab w:val="num" w:pos="2160"/>
+        </w:tabs>
+        <w:ind w:left="2160" w:hanging="360"/>
+      </w:pPr>
+      <w:rPr>
+        <w:rFonts w:ascii="Wingdings" w:hAnsi="Wingdings" w:hint="default"/>
+        <w:sz w:val="20"/>
+      </w:rPr>
+    </w:lvl>
+    <w:lvl w:ilvl="3" w:tentative="1">
+      <w:start w:val="1"/>
+      <w:numFmt w:val="bullet"/>
+      <w:lvlText w:val=""/>
+      <w:lvlJc w:val="left"/>
+      <w:pPr>
+        <w:tabs>
+          <w:tab w:val="num" w:pos="2880"/>
+        </w:tabs>
+        <w:ind w:left="2880" w:hanging="360"/>
+      </w:pPr>
+      <w:rPr>
+        <w:rFonts w:ascii="Wingdings" w:hAnsi="Wingdings" w:hint="default"/>
+        <w:sz w:val="20"/>
+      </w:rPr>
+    </w:lvl>
+    <w:lvl w:ilvl="4" w:tentative="1">
+      <w:start w:val="1"/>
+      <w:numFmt w:val="bullet"/>
+      <w:lvlText w:val=""/>
+      <w:lvlJc w:val="left"/>
+      <w:pPr>
+        <w:tabs>
+          <w:tab w:val="num" w:pos="3600"/>
+        </w:tabs>
+        <w:ind w:left="3600" w:hanging="360"/>
+      </w:pPr>
+      <w:rPr>
+        <w:rFonts w:ascii="Wingdings" w:hAnsi="Wingdings" w:hint="default"/>
+        <w:sz w:val="20"/>
+      </w:rPr>
+    </w:lvl>
+    <w:lvl w:ilvl="5" w:tentative="1">
+      <w:start w:val="1"/>
+      <w:numFmt w:val="bullet"/>
+      <w:lvlText w:val=""/>
+      <w:lvlJc w:val="left"/>
+      <w:pPr>
+        <w:tabs>
+          <w:tab w:val="num" w:pos="4320"/>
+        </w:tabs>
+        <w:ind w:left="4320" w:hanging="360"/>
+      </w:pPr>
+      <w:rPr>
+        <w:rFonts w:ascii="Wingdings" w:hAnsi="Wingdings" w:hint="default"/>
+        <w:sz w:val="20"/>
+      </w:rPr>
+    </w:lvl>
+    <w:lvl w:ilvl="6" w:tentative="1">
+      <w:start w:val="1"/>
+      <w:numFmt w:val="bullet"/>
+      <w:lvlText w:val=""/>
+      <w:lvlJc w:val="left"/>
+      <w:pPr>
+        <w:tabs>
+          <w:tab w:val="num" w:pos="5040"/>
+        </w:tabs>
+        <w:ind w:left="5040" w:hanging="360"/>
+      </w:pPr>
+      <w:rPr>
+        <w:rFonts w:ascii="Wingdings" w:hAnsi="Wingdings" w:hint="default"/>
+        <w:sz w:val="20"/>
+      </w:rPr>
+    </w:lvl>
+    <w:lvl w:ilvl="7" w:tentative="1">
+      <w:start w:val="1"/>
+      <w:numFmt w:val="bullet"/>
+      <w:lvlText w:val=""/>
+      <w:lvlJc w:val="left"/>
+      <w:pPr>
+        <w:tabs>
+          <w:tab w:val="num" w:pos="5760"/>
+        </w:tabs>
+        <w:ind w:left="5760" w:hanging="360"/>
+      </w:pPr>
+      <w:rPr>
+        <w:rFonts w:ascii="Wingdings" w:hAnsi="Wingdings" w:hint="default"/>
+        <w:sz w:val="20"/>
+      </w:rPr>
+    </w:lvl>
+    <w:lvl w:ilvl="8" w:tentative="1">
+      <w:start w:val="1"/>
+      <w:numFmt w:val="bullet"/>
+      <w:lvlText w:val=""/>
+      <w:lvlJc w:val="left"/>
+      <w:pPr>
+        <w:tabs>
+          <w:tab w:val="num" w:pos="6480"/>
+        </w:tabs>
+        <w:ind w:left="6480" w:hanging="360"/>
+      </w:pPr>
+      <w:rPr>
+        <w:rFonts w:ascii="Wingdings" w:hAnsi="Wingdings" w:hint="default"/>
+        <w:sz w:val="20"/>
+      </w:rPr>
+    </w:lvl>
+  </w:abstractNum>
+  <w:abstractNum w:abstractNumId="6" w15:restartNumberingAfterBreak="0">
     <w:nsid w:val="2E652476"/>
     <w:multiLevelType w:val="hybridMultilevel"/>
     <w:tmpl w:val="EEFCE0B0"/>
@@ -5323,7 +6139,7 @@
       </w:rPr>
     </w:lvl>
   </w:abstractNum>
-  <w:abstractNum w:abstractNumId="5" w15:restartNumberingAfterBreak="0">
+  <w:abstractNum w:abstractNumId="7" w15:restartNumberingAfterBreak="0">
     <w:nsid w:val="3C3E54FB"/>
     <w:multiLevelType w:val="multilevel"/>
     <w:tmpl w:val="CD70E38E"/>
@@ -5472,7 +6288,7 @@
       </w:rPr>
     </w:lvl>
   </w:abstractNum>
-  <w:abstractNum w:abstractNumId="6" w15:restartNumberingAfterBreak="0">
+  <w:abstractNum w:abstractNumId="8" w15:restartNumberingAfterBreak="0">
     <w:nsid w:val="422D7977"/>
     <w:multiLevelType w:val="hybridMultilevel"/>
     <w:tmpl w:val="32F8A258"/>
@@ -5684,7 +6500,7 @@
       </w:rPr>
     </w:lvl>
   </w:abstractNum>
-  <w:abstractNum w:abstractNumId="7" w15:restartNumberingAfterBreak="0">
+  <w:abstractNum w:abstractNumId="9" w15:restartNumberingAfterBreak="0">
     <w:nsid w:val="4BEA26EA"/>
     <w:multiLevelType w:val="hybridMultilevel"/>
     <w:tmpl w:val="2D58FA76"/>
@@ -5897,7 +6713,7 @@
       </w:rPr>
     </w:lvl>
   </w:abstractNum>
-  <w:abstractNum w:abstractNumId="8" w15:restartNumberingAfterBreak="0">
+  <w:abstractNum w:abstractNumId="10" w15:restartNumberingAfterBreak="0">
     <w:nsid w:val="582124CC"/>
     <w:multiLevelType w:val="hybridMultilevel"/>
     <w:tmpl w:val="CE0E80A6"/>
@@ -6109,7 +6925,124 @@
       </w:rPr>
     </w:lvl>
   </w:abstractNum>
-  <w:abstractNum w:abstractNumId="9" w15:restartNumberingAfterBreak="0">
+  <w:abstractNum w:abstractNumId="11" w15:restartNumberingAfterBreak="0">
+    <w:nsid w:val="6B492C33"/>
+    <w:multiLevelType w:val="multilevel"/>
+    <w:tmpl w:val="A924633E"/>
+    <w:lvl w:ilvl="0">
+      <w:start w:val="1"/>
+      <w:numFmt w:val="decimal"/>
+      <w:lvlText w:val="%1."/>
+      <w:lvlJc w:val="left"/>
+      <w:pPr>
+        <w:tabs>
+          <w:tab w:val="num" w:pos="720"/>
+        </w:tabs>
+        <w:ind w:left="720" w:hanging="360"/>
+      </w:pPr>
+    </w:lvl>
+    <w:lvl w:ilvl="1">
+      <w:start w:val="1"/>
+      <w:numFmt w:val="bullet"/>
+      <w:lvlText w:val="o"/>
+      <w:lvlJc w:val="left"/>
+      <w:pPr>
+        <w:tabs>
+          <w:tab w:val="num" w:pos="1440"/>
+        </w:tabs>
+        <w:ind w:left="1440" w:hanging="360"/>
+      </w:pPr>
+      <w:rPr>
+        <w:rFonts w:ascii="Courier New" w:hAnsi="Courier New" w:hint="default"/>
+        <w:sz w:val="20"/>
+      </w:rPr>
+    </w:lvl>
+    <w:lvl w:ilvl="2" w:tentative="1">
+      <w:start w:val="1"/>
+      <w:numFmt w:val="decimal"/>
+      <w:lvlText w:val="%3."/>
+      <w:lvlJc w:val="left"/>
+      <w:pPr>
+        <w:tabs>
+          <w:tab w:val="num" w:pos="2160"/>
+        </w:tabs>
+        <w:ind w:left="2160" w:hanging="360"/>
+      </w:pPr>
+    </w:lvl>
+    <w:lvl w:ilvl="3" w:tentative="1">
+      <w:start w:val="1"/>
+      <w:numFmt w:val="decimal"/>
+      <w:lvlText w:val="%4."/>
+      <w:lvlJc w:val="left"/>
+      <w:pPr>
+        <w:tabs>
+          <w:tab w:val="num" w:pos="2880"/>
+        </w:tabs>
+        <w:ind w:left="2880" w:hanging="360"/>
+      </w:pPr>
+    </w:lvl>
+    <w:lvl w:ilvl="4" w:tentative="1">
+      <w:start w:val="1"/>
+      <w:numFmt w:val="decimal"/>
+      <w:lvlText w:val="%5."/>
+      <w:lvlJc w:val="left"/>
+      <w:pPr>
+        <w:tabs>
+          <w:tab w:val="num" w:pos="3600"/>
+        </w:tabs>
+        <w:ind w:left="3600" w:hanging="360"/>
+      </w:pPr>
+    </w:lvl>
+    <w:lvl w:ilvl="5" w:tentative="1">
+      <w:start w:val="1"/>
+      <w:numFmt w:val="decimal"/>
+      <w:lvlText w:val="%6."/>
+      <w:lvlJc w:val="left"/>
+      <w:pPr>
+        <w:tabs>
+          <w:tab w:val="num" w:pos="4320"/>
+        </w:tabs>
+        <w:ind w:left="4320" w:hanging="360"/>
+      </w:pPr>
+    </w:lvl>
+    <w:lvl w:ilvl="6" w:tentative="1">
+      <w:start w:val="1"/>
+      <w:numFmt w:val="decimal"/>
+      <w:lvlText w:val="%7."/>
+      <w:lvlJc w:val="left"/>
+      <w:pPr>
+        <w:tabs>
+          <w:tab w:val="num" w:pos="5040"/>
+        </w:tabs>
+        <w:ind w:left="5040" w:hanging="360"/>
+      </w:pPr>
+    </w:lvl>
+    <w:lvl w:ilvl="7" w:tentative="1">
+      <w:start w:val="1"/>
+      <w:numFmt w:val="decimal"/>
+      <w:lvlText w:val="%8."/>
+      <w:lvlJc w:val="left"/>
+      <w:pPr>
+        <w:tabs>
+          <w:tab w:val="num" w:pos="5760"/>
+        </w:tabs>
+        <w:ind w:left="5760" w:hanging="360"/>
+      </w:pPr>
+    </w:lvl>
+    <w:lvl w:ilvl="8" w:tentative="1">
+      <w:start w:val="1"/>
+      <w:numFmt w:val="decimal"/>
+      <w:lvlText w:val="%9."/>
+      <w:lvlJc w:val="left"/>
+      <w:pPr>
+        <w:tabs>
+          <w:tab w:val="num" w:pos="6480"/>
+        </w:tabs>
+        <w:ind w:left="6480" w:hanging="360"/>
+      </w:pPr>
+    </w:lvl>
+  </w:abstractNum>
+  <w:abstractNum w:abstractNumId="12" w15:restartNumberingAfterBreak="0">
     <w:nsid w:val="754B7FEF"/>
     <w:multiLevelType w:val="hybridMultilevel"/>
     <w:tmpl w:val="ABC6554E"/>
@@ -6322,7 +7255,156 @@
       </w:rPr>
     </w:lvl>
   </w:abstractNum>
-  <w:abstractNum w:abstractNumId="10" w15:restartNumberingAfterBreak="0">
+  <w:abstractNum w:abstractNumId="13" w15:restartNumberingAfterBreak="0">
+    <w:nsid w:val="79B72C3C"/>
+    <w:multiLevelType w:val="multilevel"/>
+    <w:tmpl w:val="7E783900"/>
+    <w:lvl w:ilvl="0">
+      <w:start w:val="1"/>
+      <w:numFmt w:val="bullet"/>
+      <w:lvlText w:val=""/>
+      <w:lvlJc w:val="left"/>
+      <w:pPr>
+        <w:tabs>
+          <w:tab w:val="num" w:pos="720"/>
+        </w:tabs>
+        <w:ind w:left="720" w:hanging="360"/>
+      </w:pPr>
+      <w:rPr>
+        <w:rFonts w:ascii="Symbol" w:hAnsi="Symbol" w:hint="default"/>
+        <w:sz w:val="20"/>
+      </w:rPr>
+    </w:lvl>
+    <w:lvl w:ilvl="1" w:tentative="1">
+      <w:start w:val="1"/>
+      <w:numFmt w:val="bullet"/>
+      <w:lvlText w:val="o"/>
+      <w:lvlJc w:val="left"/>
+      <w:pPr>
+        <w:tabs>
+          <w:tab w:val="num" w:pos="1440"/>
+        </w:tabs>
+        <w:ind w:left="1440" w:hanging="360"/>
+      </w:pPr>
+      <w:rPr>
+        <w:rFonts w:ascii="Courier New" w:hAnsi="Courier New" w:hint="default"/>
+        <w:sz w:val="20"/>
+      </w:rPr>
+    </w:lvl>
+    <w:lvl w:ilvl="2" w:tentative="1">
+      <w:start w:val="1"/>
+      <w:numFmt w:val="bullet"/>
+      <w:lvlText w:val=""/>
+      <w:lvlJc w:val="left"/>
+      <w:pPr>
+        <w:tabs>
+          <w:tab w:val="num" w:pos="2160"/>
+        </w:tabs>
+        <w:ind w:left="2160" w:hanging="360"/>
+      </w:pPr>
+      <w:rPr>
+        <w:rFonts w:ascii="Wingdings" w:hAnsi="Wingdings" w:hint="default"/>
+        <w:sz w:val="20"/>
+      </w:rPr>
+    </w:lvl>
+    <w:lvl w:ilvl="3" w:tentative="1">
+      <w:start w:val="1"/>
+      <w:numFmt w:val="bullet"/>
+      <w:lvlText w:val=""/>
+      <w:lvlJc w:val="left"/>
+      <w:pPr>
+        <w:tabs>
+          <w:tab w:val="num" w:pos="2880"/>
+        </w:tabs>
+        <w:ind w:left="2880" w:hanging="360"/>
+      </w:pPr>
+      <w:rPr>
+        <w:rFonts w:ascii="Wingdings" w:hAnsi="Wingdings" w:hint="default"/>
+        <w:sz w:val="20"/>
+      </w:rPr>
+    </w:lvl>
+    <w:lvl w:ilvl="4" w:tentative="1">
+      <w:start w:val="1"/>
+      <w:numFmt w:val="bullet"/>
+      <w:lvlText w:val=""/>
+      <w:lvlJc w:val="left"/>
+      <w:pPr>
+        <w:tabs>
+          <w:tab w:val="num" w:pos="3600"/>
+        </w:tabs>
+        <w:ind w:left="3600" w:hanging="360"/>
+      </w:pPr>
+      <w:rPr>
+        <w:rFonts w:ascii="Wingdings" w:hAnsi="Wingdings" w:hint="default"/>
+        <w:sz w:val="20"/>
+      </w:rPr>
+    </w:lvl>
+    <w:lvl w:ilvl="5" w:tentative="1">
+      <w:start w:val="1"/>
+      <w:numFmt w:val="bullet"/>
+      <w:lvlText w:val=""/>
+      <w:lvlJc w:val="left"/>
+      <w:pPr>
+        <w:tabs>
+          <w:tab w:val="num" w:pos="4320"/>
+        </w:tabs>
+        <w:ind w:left="4320" w:hanging="360"/>
+      </w:pPr>
+      <w:rPr>
+        <w:rFonts w:ascii="Wingdings" w:hAnsi="Wingdings" w:hint="default"/>
+        <w:sz w:val="20"/>
+      </w:rPr>
+    </w:lvl>
+    <w:lvl w:ilvl="6" w:tentative="1">
+      <w:start w:val="1"/>
+      <w:numFmt w:val="bullet"/>
+      <w:lvlText w:val=""/>
+      <w:lvlJc w:val="left"/>
+      <w:pPr>
+        <w:tabs>
+          <w:tab w:val="num" w:pos="5040"/>
+        </w:tabs>
+        <w:ind w:left="5040" w:hanging="360"/>
+      </w:pPr>
+      <w:rPr>
+        <w:rFonts w:ascii="Wingdings" w:hAnsi="Wingdings" w:hint="default"/>
+        <w:sz w:val="20"/>
+      </w:rPr>
+    </w:lvl>
+    <w:lvl w:ilvl="7" w:tentative="1">
+      <w:start w:val="1"/>
+      <w:numFmt w:val="bullet"/>
+      <w:lvlText w:val=""/>
+      <w:lvlJc w:val="left"/>
+      <w:pPr>
+        <w:tabs>
+          <w:tab w:val="num" w:pos="5760"/>
+        </w:tabs>
+        <w:ind w:left="5760" w:hanging="360"/>
+      </w:pPr>
+      <w:rPr>
+        <w:rFonts w:ascii="Wingdings" w:hAnsi="Wingdings" w:hint="default"/>
+        <w:sz w:val="20"/>
+      </w:rPr>
+    </w:lvl>
+    <w:lvl w:ilvl="8" w:tentative="1">
+      <w:start w:val="1"/>
+      <w:numFmt w:val="bullet"/>
+      <w:lvlText w:val=""/>
+      <w:lvlJc w:val="left"/>
+      <w:pPr>
+        <w:tabs>
+          <w:tab w:val="num" w:pos="6480"/>
+        </w:tabs>
+        <w:ind w:left="6480" w:hanging="360"/>
+      </w:pPr>
+      <w:rPr>
+        <w:rFonts w:ascii="Wingdings" w:hAnsi="Wingdings" w:hint="default"/>
+        <w:sz w:val="20"/>
+      </w:rPr>
+    </w:lvl>
+  </w:abstractNum>
+  <w:abstractNum w:abstractNumId="14" w15:restartNumberingAfterBreak="0">
     <w:nsid w:val="7D5035D9"/>
     <w:multiLevelType w:val="hybridMultilevel"/>
     <w:tmpl w:val="092298E4"/>
@@ -6535,37 +7617,49 @@
     </w:lvl>
   </w:abstractNum>
   <w:num w:numId="1" w16cid:durableId="1198858992">
-    <w:abstractNumId w:val="1"/>
+    <w:abstractNumId w:val="2"/>
   </w:num>
   <w:num w:numId="2" w16cid:durableId="1789662658">
-    <w:abstractNumId w:val="3"/>
+    <w:abstractNumId w:val="4"/>
   </w:num>
   <w:num w:numId="3" w16cid:durableId="586770001">
-    <w:abstractNumId w:val="7"/>
+    <w:abstractNumId w:val="9"/>
   </w:num>
   <w:num w:numId="4" w16cid:durableId="511384632">
-    <w:abstractNumId w:val="4"/>
+    <w:abstractNumId w:val="6"/>
   </w:num>
   <w:num w:numId="5" w16cid:durableId="843277162">
+    <w:abstractNumId w:val="10"/>
+  </w:num>
+  <w:num w:numId="6" w16cid:durableId="1145010038">
+    <w:abstractNumId w:val="12"/>
+  </w:num>
+  <w:num w:numId="7" w16cid:durableId="1945839747">
     <w:abstractNumId w:val="8"/>
   </w:num>
-  <w:num w:numId="6" w16cid:durableId="1145010038">
-    <w:abstractNumId w:val="9"/>
-  </w:num>
-  <w:num w:numId="7" w16cid:durableId="1945839747">
-    <w:abstractNumId w:val="6"/>
-  </w:num>
   <w:num w:numId="8" w16cid:durableId="770006486">
-    <w:abstractNumId w:val="10"/>
+    <w:abstractNumId w:val="14"/>
   </w:num>
   <w:num w:numId="9" w16cid:durableId="879123238">
-    <w:abstractNumId w:val="5"/>
+    <w:abstractNumId w:val="7"/>
   </w:num>
   <w:num w:numId="10" w16cid:durableId="972365013">
     <w:abstractNumId w:val="0"/>
   </w:num>
   <w:num w:numId="11" w16cid:durableId="33846771">
-    <w:abstractNumId w:val="2"/>
+    <w:abstractNumId w:val="3"/>
+  </w:num>
+  <w:num w:numId="12" w16cid:durableId="1786192622">
+    <w:abstractNumId w:val="11"/>
+  </w:num>
+  <w:num w:numId="13" w16cid:durableId="705527278">
+    <w:abstractNumId w:val="5"/>
+  </w:num>
+  <w:num w:numId="14" w16cid:durableId="383678054">
+    <w:abstractNumId w:val="13"/>
+  </w:num>
+  <w:num w:numId="15" w16cid:durableId="1919948082">
+    <w:abstractNumId w:val="1"/>
   </w:num>
 </w:numbering>
 </file>

</xml_diff>